<commit_message>
Embed all four figures into manuscript + figures docx; unify ED1 with its legend (panel d 'reading as normal' 24%/96%; panel e adds judge-vs-rule-based hemorrhage κ 0.95); sync 23%->24% in text/legend
</commit_message>
<xml_diff>
--- a/incoming/edited/NeuroVFM_Matters_Arising_figures.docx
+++ b/incoming/edited/NeuroVFM_Matters_Arising_figures.docx
@@ -11,8 +11,42 @@
       </w:r>
     </w:p>
     <w:p>
-      <w:r>
-        <w:t>[Insert Figure 1 here]</w:t>
+      <w:pPr>
+        <w:jc w:val="center"/>
+      </w:pPr>
+      <w:r>
+        <w:drawing>
+          <wp:inline xmlns:a="http://schemas.openxmlformats.org/drawingml/2006/main" xmlns:pic="http://schemas.openxmlformats.org/drawingml/2006/picture">
+            <wp:extent cx="5943600" cy="3637395"/>
+            <wp:docPr id="1" name="Picture 1"/>
+            <wp:cNvGraphicFramePr>
+              <a:graphicFrameLocks noChangeAspect="1"/>
+            </wp:cNvGraphicFramePr>
+            <a:graphic>
+              <a:graphicData uri="http://schemas.openxmlformats.org/drawingml/2006/picture">
+                <pic:pic>
+                  <pic:nvPicPr>
+                    <pic:cNvPr id="0" name="fig1.png"/>
+                    <pic:cNvPicPr/>
+                  </pic:nvPicPr>
+                  <pic:blipFill>
+                    <a:blip r:embed="rId8"/>
+                    <a:stretch>
+                      <a:fillRect/>
+                    </a:stretch>
+                  </pic:blipFill>
+                  <pic:spPr>
+                    <a:xfrm>
+                      <a:off x="0" y="0"/>
+                      <a:ext cx="5943600" cy="3637395"/>
+                    </a:xfrm>
+                    <a:prstGeom prst="rect"/>
+                  </pic:spPr>
+                </pic:pic>
+              </a:graphicData>
+            </a:graphic>
+          </wp:inline>
+        </w:drawing>
       </w:r>
     </w:p>
     <w:p>
@@ -30,8 +64,42 @@
       <w:r/>
     </w:p>
     <w:p>
-      <w:r>
-        <w:t>[Insert Extended Data Figure 1 here]</w:t>
+      <w:pPr>
+        <w:jc w:val="center"/>
+      </w:pPr>
+      <w:r>
+        <w:drawing>
+          <wp:inline xmlns:a="http://schemas.openxmlformats.org/drawingml/2006/main" xmlns:pic="http://schemas.openxmlformats.org/drawingml/2006/picture">
+            <wp:extent cx="5943600" cy="3117571"/>
+            <wp:docPr id="2" name="Picture 2"/>
+            <wp:cNvGraphicFramePr>
+              <a:graphicFrameLocks noChangeAspect="1"/>
+            </wp:cNvGraphicFramePr>
+            <a:graphic>
+              <a:graphicData uri="http://schemas.openxmlformats.org/drawingml/2006/picture">
+                <pic:pic>
+                  <pic:nvPicPr>
+                    <pic:cNvPr id="0" name="ed1.png"/>
+                    <pic:cNvPicPr/>
+                  </pic:nvPicPr>
+                  <pic:blipFill>
+                    <a:blip r:embed="rId9"/>
+                    <a:stretch>
+                      <a:fillRect/>
+                    </a:stretch>
+                  </pic:blipFill>
+                  <pic:spPr>
+                    <a:xfrm>
+                      <a:off x="0" y="0"/>
+                      <a:ext cx="5943600" cy="3117571"/>
+                    </a:xfrm>
+                    <a:prstGeom prst="rect"/>
+                  </pic:spPr>
+                </pic:pic>
+              </a:graphicData>
+            </a:graphic>
+          </wp:inline>
+        </w:drawing>
       </w:r>
     </w:p>
     <w:p>
@@ -42,15 +110,49 @@
         <w:t>Extended Data Fig. 1.</w:t>
       </w:r>
       <w:r>
-        <w:t xml:space="preserve"> Classification of report-pipeline misses under two definitions and two screening models. Each miss was classified as reasoning (the report named a critical finding that was not escalated), decoding (the report was silent and the classifier detected the finding) or perception (the report was silent and the classifier did not detect the finding). a, Classification of the 55 misses when classifier detection is defined as a score above 0.5 on the highest-scoring positive finding (40 decoding, 10 perception, 5 reasoning), and when it is defined as flagging the study at the matched alarm rate (13 decoding, 37 perception, 5 reasoning). b, The same classification with Claude as the screening model (of 48 misses, 34 decoding, 10 perception and 4 reasoning with the 0.5 score, and 11 decoding, 33 perception and 4 reasoning at the matched alarm rate). Acuity agreement between the two screeners was 96.6%. c, Decoding misses by critical finding with the 0.5 score (calvarial fracture 9, intraparenchymal hemorrhage 8, intracranial hemorrhage 8, subdural hematoma 5, mass effect 5, subarachnoid hemorrhage 3, epidural hematoma 2). d, Fraction of generated reports reading as normal among urgent (23%) and non-urgent (96%) studies. e, Agreement on whether each reference finding was mentioned, between GPT-5 and Claude as judges (mean κ 0.97) and between each judge and a rule-based detector (κ 0.92 or higher for hemorrhage findings).</w:t>
+        <w:t xml:space="preserve"> Classification of report-pipeline misses under two definitions and two screening models. Each miss was classified as reasoning (the report named a critical finding that was not escalated), decoding (the report was silent and the classifier detected the finding) or perception (the report was silent and the classifier did not detect the finding). a, Classification of the 55 misses when classifier detection is defined as a score above 0.5 on the highest-scoring positive finding (40 decoding, 10 perception, 5 reasoning), and when it is defined as flagging the study at the matched alarm rate (13 decoding, 37 perception, 5 reasoning). b, The same classification with Claude as the screening model (of 48 misses, 34 decoding, 10 perception and 4 reasoning with the 0.5 score, and 11 decoding, 33 perception and 4 reasoning at the matched alarm rate). Acuity agreement between the two screeners was 96.6%. c, Decoding misses by critical finding with the 0.5 score (calvarial fracture 9, intraparenchymal hemorrhage 8, intracranial hemorrhage 8, subdural hematoma 5, mass effect 5, subarachnoid hemorrhage 3, epidural hematoma 2). d, Fraction of generated reports reading as normal among urgent (24%) and non-urgent (96%) studies. e, Agreement on whether each reference finding was mentioned, between GPT-5 and Claude as judges (mean κ 0.97) and between each judge and a rule-based detector (κ 0.92 or higher for hemorrhage findings).</w:t>
       </w:r>
     </w:p>
     <w:p>
       <w:r/>
     </w:p>
     <w:p>
-      <w:r>
-        <w:t>[Insert Extended Data Figure 2 here]</w:t>
+      <w:pPr>
+        <w:jc w:val="center"/>
+      </w:pPr>
+      <w:r>
+        <w:drawing>
+          <wp:inline xmlns:a="http://schemas.openxmlformats.org/drawingml/2006/main" xmlns:pic="http://schemas.openxmlformats.org/drawingml/2006/picture">
+            <wp:extent cx="5943600" cy="2013288"/>
+            <wp:docPr id="3" name="Picture 3"/>
+            <wp:cNvGraphicFramePr>
+              <a:graphicFrameLocks noChangeAspect="1"/>
+            </wp:cNvGraphicFramePr>
+            <a:graphic>
+              <a:graphicData uri="http://schemas.openxmlformats.org/drawingml/2006/picture">
+                <pic:pic>
+                  <pic:nvPicPr>
+                    <pic:cNvPr id="0" name="ed2.png"/>
+                    <pic:cNvPicPr/>
+                  </pic:nvPicPr>
+                  <pic:blipFill>
+                    <a:blip r:embed="rId10"/>
+                    <a:stretch>
+                      <a:fillRect/>
+                    </a:stretch>
+                  </pic:blipFill>
+                  <pic:spPr>
+                    <a:xfrm>
+                      <a:off x="0" y="0"/>
+                      <a:ext cx="5943600" cy="2013288"/>
+                    </a:xfrm>
+                    <a:prstGeom prst="rect"/>
+                  </pic:spPr>
+                </pic:pic>
+              </a:graphicData>
+            </a:graphic>
+          </wp:inline>
+        </w:drawing>
       </w:r>
     </w:p>
     <w:p>
@@ -68,8 +170,42 @@
       <w:r/>
     </w:p>
     <w:p>
-      <w:r>
-        <w:t>[Insert Extended Data Figure 3 here]</w:t>
+      <w:pPr>
+        <w:jc w:val="center"/>
+      </w:pPr>
+      <w:r>
+        <w:drawing>
+          <wp:inline xmlns:a="http://schemas.openxmlformats.org/drawingml/2006/main" xmlns:pic="http://schemas.openxmlformats.org/drawingml/2006/picture">
+            <wp:extent cx="5943600" cy="4612410"/>
+            <wp:docPr id="4" name="Picture 4"/>
+            <wp:cNvGraphicFramePr>
+              <a:graphicFrameLocks noChangeAspect="1"/>
+            </wp:cNvGraphicFramePr>
+            <a:graphic>
+              <a:graphicData uri="http://schemas.openxmlformats.org/drawingml/2006/picture">
+                <pic:pic>
+                  <pic:nvPicPr>
+                    <pic:cNvPr id="0" name="ed3.png"/>
+                    <pic:cNvPicPr/>
+                  </pic:nvPicPr>
+                  <pic:blipFill>
+                    <a:blip r:embed="rId11"/>
+                    <a:stretch>
+                      <a:fillRect/>
+                    </a:stretch>
+                  </pic:blipFill>
+                  <pic:spPr>
+                    <a:xfrm>
+                      <a:off x="0" y="0"/>
+                      <a:ext cx="5943600" cy="4612410"/>
+                    </a:xfrm>
+                    <a:prstGeom prst="rect"/>
+                  </pic:spPr>
+                </pic:pic>
+              </a:graphicData>
+            </a:graphic>
+          </wp:inline>
+        </w:drawing>
       </w:r>
     </w:p>
     <w:p>

</xml_diff>

<commit_message>
Double-space manuscript + figures docx; rotate ED3 mini-bar tick labels (no overlap); verify all content fixes integrated and figures embedded
</commit_message>
<xml_diff>
--- a/incoming/edited/NeuroVFM_Matters_Arising_figures.docx
+++ b/incoming/edited/NeuroVFM_Matters_Arising_figures.docx
@@ -3,6 +3,9 @@
 <w:document xmlns:wpc="http://schemas.microsoft.com/office/word/2010/wordprocessingCanvas" xmlns:mc="http://schemas.openxmlformats.org/markup-compatibility/2006" xmlns:o="urn:schemas-microsoft-com:office:office" xmlns:r="http://schemas.openxmlformats.org/officeDocument/2006/relationships" xmlns:m="http://schemas.openxmlformats.org/officeDocument/2006/math" xmlns:v="urn:schemas-microsoft-com:vml" xmlns:wp14="http://schemas.microsoft.com/office/word/2010/wordprocessingDrawing" xmlns:wp="http://schemas.openxmlformats.org/drawingml/2006/wordprocessingDrawing" xmlns:w10="urn:schemas-microsoft-com:office:word" xmlns:w="http://schemas.openxmlformats.org/wordprocessingml/2006/main" xmlns:w14="http://schemas.microsoft.com/office/word/2010/wordml" xmlns:w15="http://schemas.microsoft.com/office/word/2012/wordml" xmlns:wpg="http://schemas.microsoft.com/office/word/2010/wordprocessingGroup" xmlns:wpi="http://schemas.microsoft.com/office/word/2010/wordprocessingInk" xmlns:wne="http://schemas.microsoft.com/office/word/2006/wordml" xmlns:wps="http://schemas.microsoft.com/office/word/2010/wordprocessingShape" xmlns:cx="http://schemas.microsoft.com/office/drawing/2014/chartex" xmlns:cx1="http://schemas.microsoft.com/office/drawing/2015/9/8/chartex" xmlns:cx2="http://schemas.microsoft.com/office/drawing/2015/10/21/chartex" xmlns:cx3="http://schemas.microsoft.com/office/drawing/2016/5/9/chartex" xmlns:cx4="http://schemas.microsoft.com/office/drawing/2016/5/10/chartex" xmlns:cx5="http://schemas.microsoft.com/office/drawing/2016/5/11/chartex" xmlns:cx6="http://schemas.microsoft.com/office/drawing/2016/5/12/chartex" xmlns:cx7="http://schemas.microsoft.com/office/drawing/2016/5/13/chartex" xmlns:cx8="http://schemas.microsoft.com/office/drawing/2016/5/14/chartex" xmlns:aink="http://schemas.microsoft.com/office/drawing/2016/ink" xmlns:am3d="http://schemas.microsoft.com/office/drawing/2017/model3d" xmlns:w16cex="http://schemas.microsoft.com/office/word/2018/wordml/cex" xmlns:w16cid="http://schemas.microsoft.com/office/word/2016/wordml/cid" xmlns:w16="http://schemas.microsoft.com/office/word/2018/wordml" xmlns:w16sdtdh="http://schemas.microsoft.com/office/word/2020/wordml/sdtdatahash" xmlns:w16se="http://schemas.microsoft.com/office/word/2015/wordml/symex" mc:Ignorable="w14 w15 wp14">
   <w:body>
     <w:p>
+      <w:pPr>
+        <w:spacing w:line="480" w:lineRule="auto" w:after="0"/>
+      </w:pPr>
       <w:r>
         <w:rPr>
           <w:b/>
@@ -12,6 +15,7 @@
     </w:p>
     <w:p>
       <w:pPr>
+        <w:spacing w:line="240" w:lineRule="auto" w:before="120" w:after="120"/>
         <w:jc w:val="center"/>
       </w:pPr>
       <w:r>
@@ -50,6 +54,9 @@
       </w:r>
     </w:p>
     <w:p>
+      <w:pPr>
+        <w:spacing w:line="480" w:lineRule="auto" w:after="0"/>
+      </w:pPr>
       <w:r>
         <w:rPr>
           <w:b/>
@@ -61,10 +68,14 @@
       </w:r>
     </w:p>
     <w:p>
+      <w:pPr>
+        <w:spacing w:line="480" w:lineRule="auto" w:after="0"/>
+      </w:pPr>
       <w:r/>
     </w:p>
     <w:p>
       <w:pPr>
+        <w:spacing w:line="240" w:lineRule="auto" w:before="120" w:after="120"/>
         <w:jc w:val="center"/>
       </w:pPr>
       <w:r>
@@ -103,6 +114,9 @@
       </w:r>
     </w:p>
     <w:p>
+      <w:pPr>
+        <w:spacing w:line="480" w:lineRule="auto" w:after="0"/>
+      </w:pPr>
       <w:r>
         <w:rPr>
           <w:b/>
@@ -114,10 +128,14 @@
       </w:r>
     </w:p>
     <w:p>
+      <w:pPr>
+        <w:spacing w:line="480" w:lineRule="auto" w:after="0"/>
+      </w:pPr>
       <w:r/>
     </w:p>
     <w:p>
       <w:pPr>
+        <w:spacing w:line="240" w:lineRule="auto" w:before="120" w:after="120"/>
         <w:jc w:val="center"/>
       </w:pPr>
       <w:r>
@@ -156,6 +174,9 @@
       </w:r>
     </w:p>
     <w:p>
+      <w:pPr>
+        <w:spacing w:line="480" w:lineRule="auto" w:after="0"/>
+      </w:pPr>
       <w:r>
         <w:rPr>
           <w:b/>
@@ -167,10 +188,14 @@
       </w:r>
     </w:p>
     <w:p>
+      <w:pPr>
+        <w:spacing w:line="480" w:lineRule="auto" w:after="0"/>
+      </w:pPr>
       <w:r/>
     </w:p>
     <w:p>
       <w:pPr>
+        <w:spacing w:line="240" w:lineRule="auto" w:before="120" w:after="120"/>
         <w:jc w:val="center"/>
       </w:pPr>
       <w:r>
@@ -209,6 +234,9 @@
       </w:r>
     </w:p>
     <w:p>
+      <w:pPr>
+        <w:spacing w:line="480" w:lineRule="auto" w:after="0"/>
+      </w:pPr>
       <w:r>
         <w:rPr>
           <w:b/>
@@ -220,6 +248,9 @@
       </w:r>
     </w:p>
     <w:p>
+      <w:pPr>
+        <w:spacing w:line="480" w:lineRule="auto" w:after="0"/>
+      </w:pPr>
       <w:r/>
     </w:p>
     <w:sectPr>

</xml_diff>